<commit_message>
docs: fill in student details in proposal
- Student name: Yusuf Umar Saleh
- Reg No: N23EE010
- Department: Electrical Engineering

Supervisor name remains as a placeholder [SUPERVISOR NAME] for the
student to fill in once assigned.
</commit_message>
<xml_diff>
--- a/docs/proposal/Project_Proposal_Smart_USB_Power_Socket_HUKPolyKatsina.docx
+++ b/docs/proposal/Project_Proposal_Smart_USB_Power_Socket_HUKPolyKatsina.docx
@@ -117,7 +117,7 @@
         <w:jc w:val="center"/>
       </w:pPr>
       <w:r>
-        <w:t>[STUDENT NAME]</w:t>
+        <w:t>Yusuf Umar Saleh</w:t>
       </w:r>
     </w:p>
     <w:p>
@@ -130,7 +130,7 @@
           <w:sz w:val="22"/>
           <w:szCs w:val="22"/>
         </w:rPr>
-        <w:t>Matric Number: [MATRIC NUMBER]</w:t>
+        <w:t>Matric Number: N23EE010</w:t>
       </w:r>
     </w:p>
     <w:p>

</xml_diff>